<commit_message>
vistoria: atualiza mapeamento checklist para template 21 colunas
Template removeu coluna extra no 6o item de cada grupo.
Sensor re, Oleo motor, Agua, Tampa Prx, Lingueta: N=18, A=19 (era N=19, A=20).

Co-Authored-By: Claude Sonnet 4.6 <noreply@anthropic.com>
</commit_message>
<xml_diff>
--- a/docx_templates/VISTORIA_TESTE_1.docx
+++ b/docx_templates/VISTORIA_TESTE_1.docx
@@ -108,15 +108,6 @@
         <w:t>Ordem de serviço e vistoria</w:t>
       </w:r>
     </w:p>
-    <w:p>
-      <w:pPr>
-        <w:spacing w:after="120"/>
-        <w:jc w:val="center"/>
-        <w:rPr>
-          <w:color w:val="000000" w:themeColor="text1"/>
-        </w:rPr>
-      </w:pPr>
-    </w:p>
     <w:tbl>
       <w:tblPr>
         <w:tblW w:w="10894" w:type="dxa"/>
@@ -135,14 +126,14 @@
         <w:tblLook w:val="0000" w:firstRow="0" w:lastRow="0" w:firstColumn="0" w:lastColumn="0" w:noHBand="0" w:noVBand="0"/>
       </w:tblPr>
       <w:tblGrid>
-        <w:gridCol w:w="1800"/>
-        <w:gridCol w:w="5438"/>
+        <w:gridCol w:w="1799"/>
+        <w:gridCol w:w="5439"/>
         <w:gridCol w:w="1181"/>
         <w:gridCol w:w="2475"/>
       </w:tblGrid>
       <w:tr>
         <w:trPr>
-          <w:trHeight w:val="243"/>
+          <w:trHeight w:val="258"/>
         </w:trPr>
         <w:tc>
           <w:tcPr>
@@ -197,6 +188,9 @@
               </w:rPr>
             </w:pPr>
             <w:r>
+              <w:t xml:space="preserve">  </w:t>
+            </w:r>
+            <w:r>
               <w:t>[  ]</w:t>
             </w:r>
           </w:p>
@@ -324,6 +318,9 @@
               </w:rPr>
             </w:pPr>
             <w:r>
+              <w:t xml:space="preserve">  </w:t>
+            </w:r>
+            <w:r>
               <w:t>[  ]</w:t>
             </w:r>
           </w:p>
@@ -441,6 +438,9 @@
               </w:rPr>
             </w:pPr>
             <w:r>
+              <w:t xml:space="preserve">  </w:t>
+            </w:r>
+            <w:r>
               <w:t>[  ]</w:t>
             </w:r>
           </w:p>
@@ -558,6 +558,9 @@
               </w:rPr>
             </w:pPr>
             <w:r>
+              <w:t xml:space="preserve">  </w:t>
+            </w:r>
+            <w:r>
               <w:t>[  ]</w:t>
             </w:r>
           </w:p>
@@ -675,6 +678,9 @@
               </w:rPr>
             </w:pPr>
             <w:r>
+              <w:t xml:space="preserve">  </w:t>
+            </w:r>
+            <w:r>
               <w:t>[  ]</w:t>
             </w:r>
           </w:p>
@@ -792,6 +798,9 @@
               </w:rPr>
             </w:pPr>
             <w:r>
+              <w:t xml:space="preserve">  </w:t>
+            </w:r>
+            <w:r>
               <w:t>[  ]</w:t>
             </w:r>
           </w:p>
@@ -915,7 +924,31 @@
               </w:rPr>
             </w:pPr>
             <w:r>
-              <w:t>[  ] MT [  ] 6/8 [  ] TC</w:t>
+              <w:t xml:space="preserve">  </w:t>
+            </w:r>
+            <w:proofErr w:type="gramStart"/>
+            <w:r>
+              <w:t>[  ]</w:t>
+            </w:r>
+            <w:proofErr w:type="gramEnd"/>
+            <w:r>
+              <w:t xml:space="preserve"> MT </w:t>
+            </w:r>
+            <w:proofErr w:type="gramStart"/>
+            <w:r>
+              <w:t>[  ]</w:t>
+            </w:r>
+            <w:proofErr w:type="gramEnd"/>
+            <w:r>
+              <w:t xml:space="preserve"> 6/8 </w:t>
+            </w:r>
+            <w:proofErr w:type="gramStart"/>
+            <w:r>
+              <w:t>[  ]</w:t>
+            </w:r>
+            <w:proofErr w:type="gramEnd"/>
+            <w:r>
+              <w:t xml:space="preserve"> TC</w:t>
             </w:r>
           </w:p>
         </w:tc>
@@ -982,6 +1015,9 @@
             <w:vAlign w:val="center"/>
           </w:tcPr>
           <w:p>
+            <w:r>
+              <w:t xml:space="preserve">  </w:t>
+            </w:r>
             <w:r>
               <w:t>[  ]</w:t>
             </w:r>
@@ -997,8 +1033,16 @@
         </w:tabs>
         <w:spacing w:before="80" w:after="80"/>
         <w:jc w:val="center"/>
+        <w:rPr>
+          <w:b/>
+          <w:bCs/>
+        </w:rPr>
       </w:pPr>
       <w:r>
+        <w:rPr>
+          <w:b/>
+          <w:bCs/>
+        </w:rPr>
         <w:t>Acessórios e equipamentos existentes (S - Sim existente; N - Não existente; A - Avariado)</w:t>
       </w:r>
     </w:p>
@@ -1022,10 +1066,10 @@
         <w:tblLook w:val="0000" w:firstRow="0" w:lastRow="0" w:firstColumn="0" w:lastColumn="0" w:noHBand="0" w:noVBand="0"/>
       </w:tblPr>
       <w:tblGrid>
+        <w:gridCol w:w="734"/>
         <w:gridCol w:w="733"/>
-        <w:gridCol w:w="733"/>
-        <w:gridCol w:w="739"/>
-        <w:gridCol w:w="647"/>
+        <w:gridCol w:w="738"/>
+        <w:gridCol w:w="646"/>
         <w:gridCol w:w="186"/>
         <w:gridCol w:w="462"/>
         <w:gridCol w:w="91"/>
@@ -1037,10 +1081,9 @@
         <w:gridCol w:w="553"/>
         <w:gridCol w:w="558"/>
         <w:gridCol w:w="568"/>
-        <w:gridCol w:w="563"/>
-        <w:gridCol w:w="563"/>
-        <w:gridCol w:w="5"/>
-        <w:gridCol w:w="486"/>
+        <w:gridCol w:w="564"/>
+        <w:gridCol w:w="566"/>
+        <w:gridCol w:w="488"/>
         <w:gridCol w:w="486"/>
         <w:gridCol w:w="487"/>
         <w:gridCol w:w="12"/>
@@ -1212,7 +1255,7 @@
         <w:tc>
           <w:tcPr>
             <w:tcW w:w="1698" w:type="dxa"/>
-            <w:gridSpan w:val="4"/>
+            <w:gridSpan w:val="3"/>
             <w:tcBorders>
               <w:top w:val="single" w:sz="1" w:space="0" w:color="AAAAAA"/>
               <w:left w:val="single" w:sz="1" w:space="0" w:color="AAAAAA"/>
@@ -1812,7 +1855,6 @@
         <w:tc>
           <w:tcPr>
             <w:tcW w:w="488" w:type="dxa"/>
-            <w:gridSpan w:val="2"/>
             <w:tcBorders>
               <w:top w:val="single" w:sz="1" w:space="0" w:color="AAAAAA"/>
               <w:left w:val="single" w:sz="1" w:space="0" w:color="AAAAAA"/>
@@ -2859,7 +2901,6 @@
         <w:tc>
           <w:tcPr>
             <w:tcW w:w="488" w:type="dxa"/>
-            <w:gridSpan w:val="2"/>
             <w:tcBorders>
               <w:left w:val="single" w:sz="1" w:space="0" w:color="AAAAAA"/>
               <w:bottom w:val="single" w:sz="1" w:space="0" w:color="AAAAAA"/>
@@ -3220,7 +3261,7 @@
         <w:tc>
           <w:tcPr>
             <w:tcW w:w="1698" w:type="dxa"/>
-            <w:gridSpan w:val="4"/>
+            <w:gridSpan w:val="3"/>
             <w:tcBorders>
               <w:top w:val="single" w:sz="1" w:space="0" w:color="AAAAAA"/>
               <w:left w:val="single" w:sz="1" w:space="0" w:color="AAAAAA"/>
@@ -3856,7 +3897,6 @@
         <w:tc>
           <w:tcPr>
             <w:tcW w:w="488" w:type="dxa"/>
-            <w:gridSpan w:val="2"/>
             <w:tcBorders>
               <w:top w:val="single" w:sz="1" w:space="0" w:color="AAAAAA"/>
               <w:left w:val="single" w:sz="1" w:space="0" w:color="AAAAAA"/>
@@ -4911,7 +4951,6 @@
         <w:tc>
           <w:tcPr>
             <w:tcW w:w="488" w:type="dxa"/>
-            <w:gridSpan w:val="2"/>
             <w:tcBorders>
               <w:left w:val="single" w:sz="1" w:space="0" w:color="AAAAAA"/>
               <w:bottom w:val="single" w:sz="1" w:space="0" w:color="AAAAAA"/>
@@ -5265,7 +5304,7 @@
         <w:tc>
           <w:tcPr>
             <w:tcW w:w="1698" w:type="dxa"/>
-            <w:gridSpan w:val="4"/>
+            <w:gridSpan w:val="3"/>
             <w:tcBorders>
               <w:top w:val="single" w:sz="1" w:space="0" w:color="AAAAAA"/>
               <w:left w:val="single" w:sz="1" w:space="0" w:color="AAAAAA"/>
@@ -5891,7 +5930,6 @@
         <w:tc>
           <w:tcPr>
             <w:tcW w:w="488" w:type="dxa"/>
-            <w:gridSpan w:val="2"/>
             <w:tcBorders>
               <w:top w:val="single" w:sz="1" w:space="0" w:color="AAAAAA"/>
               <w:left w:val="single" w:sz="1" w:space="0" w:color="AAAAAA"/>
@@ -6946,7 +6984,6 @@
         <w:tc>
           <w:tcPr>
             <w:tcW w:w="488" w:type="dxa"/>
-            <w:gridSpan w:val="2"/>
             <w:tcBorders>
               <w:left w:val="single" w:sz="1" w:space="0" w:color="AAAAAA"/>
               <w:bottom w:val="single" w:sz="1" w:space="0" w:color="AAAAAA"/>
@@ -7332,7 +7369,7 @@
         <w:tc>
           <w:tcPr>
             <w:tcW w:w="1698" w:type="dxa"/>
-            <w:gridSpan w:val="4"/>
+            <w:gridSpan w:val="3"/>
             <w:tcBorders>
               <w:top w:val="single" w:sz="1" w:space="0" w:color="AAAAAA"/>
               <w:left w:val="single" w:sz="1" w:space="0" w:color="AAAAAA"/>
@@ -7946,7 +7983,6 @@
         <w:tc>
           <w:tcPr>
             <w:tcW w:w="488" w:type="dxa"/>
-            <w:gridSpan w:val="2"/>
             <w:tcBorders>
               <w:top w:val="single" w:sz="1" w:space="0" w:color="AAAAAA"/>
               <w:left w:val="single" w:sz="1" w:space="0" w:color="AAAAAA"/>
@@ -9001,7 +9037,6 @@
         <w:tc>
           <w:tcPr>
             <w:tcW w:w="488" w:type="dxa"/>
-            <w:gridSpan w:val="2"/>
             <w:tcBorders>
               <w:left w:val="single" w:sz="1" w:space="0" w:color="AAAAAA"/>
               <w:bottom w:val="single" w:sz="1" w:space="0" w:color="AAAAAA"/>
@@ -9397,7 +9432,7 @@
         <w:tc>
           <w:tcPr>
             <w:tcW w:w="1698" w:type="dxa"/>
-            <w:gridSpan w:val="4"/>
+            <w:gridSpan w:val="3"/>
             <w:tcBorders>
               <w:top w:val="single" w:sz="1" w:space="0" w:color="AAAAAA"/>
               <w:left w:val="single" w:sz="1" w:space="0" w:color="AAAAAA"/>
@@ -10033,7 +10068,6 @@
         <w:tc>
           <w:tcPr>
             <w:tcW w:w="488" w:type="dxa"/>
-            <w:gridSpan w:val="2"/>
             <w:tcBorders>
               <w:top w:val="single" w:sz="1" w:space="0" w:color="AAAAAA"/>
               <w:left w:val="single" w:sz="1" w:space="0" w:color="AAAAAA"/>
@@ -11088,7 +11122,6 @@
         <w:tc>
           <w:tcPr>
             <w:tcW w:w="488" w:type="dxa"/>
-            <w:gridSpan w:val="2"/>
             <w:tcBorders>
               <w:left w:val="single" w:sz="1" w:space="0" w:color="AAAAAA"/>
               <w:bottom w:val="single" w:sz="1" w:space="0" w:color="AAAAAA"/>
@@ -11278,13 +11311,9 @@
     </w:tbl>
     <w:p>
       <w:pPr>
-        <w:spacing w:before="80" w:after="80"/>
-      </w:pPr>
-    </w:p>
-    <w:p>
-      <w:pPr>
         <w:shd w:val="clear" w:color="auto" w:fill="DAE9F7" w:themeFill="text2" w:themeFillTint="1A"/>
         <w:spacing w:before="80" w:after="80"/>
+        <w:jc w:val="center"/>
         <w:rPr>
           <w:b/>
           <w:bCs/>
@@ -11295,15 +11324,15 @@
           <w:noProof/>
         </w:rPr>
         <w:drawing>
-          <wp:anchor distT="0" distB="0" distL="114300" distR="114300" simplePos="0" relativeHeight="251689984" behindDoc="0" locked="0" layoutInCell="1" allowOverlap="1" wp14:anchorId="62894E61" wp14:editId="5DA6310A">
+          <wp:anchor distT="0" distB="0" distL="114300" distR="114300" simplePos="0" relativeHeight="251689984" behindDoc="0" locked="0" layoutInCell="1" allowOverlap="1" wp14:anchorId="62894E61" wp14:editId="38EE5907">
             <wp:simplePos x="0" y="0"/>
             <wp:positionH relativeFrom="column">
-              <wp:posOffset>4044315</wp:posOffset>
+              <wp:posOffset>4046220</wp:posOffset>
             </wp:positionH>
             <wp:positionV relativeFrom="page">
-              <wp:posOffset>6224905</wp:posOffset>
+              <wp:posOffset>6225540</wp:posOffset>
             </wp:positionV>
-            <wp:extent cx="2743200" cy="3246755"/>
+            <wp:extent cx="2743200" cy="2857500"/>
             <wp:effectExtent l="0" t="0" r="0" b="0"/>
             <wp:wrapSquare wrapText="bothSides"/>
             <wp:docPr id="17" name="image7.jpg" title="Imagem">
@@ -11342,7 +11371,7 @@
                   <pic:spPr>
                     <a:xfrm>
                       <a:off x="0" y="0"/>
-                      <a:ext cx="2743200" cy="3246755"/>
+                      <a:ext cx="2743200" cy="2857500"/>
                     </a:xfrm>
                     <a:prstGeom prst="rect">
                       <a:avLst/>
@@ -11571,6 +11600,34 @@
     <w:p>
       <w:pPr>
         <w:spacing w:before="80" w:after="80"/>
+      </w:pPr>
+    </w:p>
+    <w:p>
+      <w:pPr>
+        <w:rPr>
+          <w:shd w:val="clear" w:color="auto" w:fill="DAE9F7" w:themeFill="text2" w:themeFillTint="1A"/>
+        </w:rPr>
+      </w:pPr>
+    </w:p>
+    <w:p>
+      <w:pPr>
+        <w:rPr>
+          <w:shd w:val="clear" w:color="auto" w:fill="DAE9F7" w:themeFill="text2" w:themeFillTint="1A"/>
+        </w:rPr>
+      </w:pPr>
+    </w:p>
+    <w:p>
+      <w:pPr>
+        <w:rPr>
+          <w:shd w:val="clear" w:color="auto" w:fill="DAE9F7" w:themeFill="text2" w:themeFillTint="1A"/>
+        </w:rPr>
+      </w:pPr>
+    </w:p>
+    <w:p>
+      <w:pPr>
+        <w:rPr>
+          <w:shd w:val="clear" w:color="auto" w:fill="DAE9F7" w:themeFill="text2" w:themeFillTint="1A"/>
+        </w:rPr>
       </w:pPr>
     </w:p>
     <w:p>

</xml_diff>